<commit_message>
Enhance Fiserv responsibilities in portfolio and CV from Confluence role documentation
</commit_message>
<xml_diff>
--- a/Nnamdi_Udoye_Salesforce_CV26-03-26.docx
+++ b/Nnamdi_Udoye_Salesforce_CV26-03-26.docx
@@ -35,7 +35,7 @@
     </w:p>
     <w:p>
       <w:r>
-        <w:t>Certified Salesforce Administrator and Sales Cloud and Service Cloud Consultant with 5+ years of Salesforce experience and 15+ years in enterprise IT. Experienced in fintech and student accommodation, with strengths in platform administration, Flow automation, data governance and controlled releases. Currently at Fiserv, leading the introduction of AI within Salesforce, reducing repetitive manual work and partnering with clients, merchants and internal teams to resolve complex issues and enhance platform capabilities.</w:t>
+        <w:t>Certified Salesforce Administrator and Sales Cloud and Service Cloud Consultant with 5+ years in Salesforce and 15+ years in enterprise IT. Experienced in fintech, platform governance, Flow automation and controlled releases. At Fiserv, lead AI introduction, improve operational efficiency and resolve complex Salesforce issues with clients, merchants and internal teams.</w:t>
       </w:r>
     </w:p>
     <w:p>
@@ -48,7 +48,7 @@
     </w:p>
     <w:p>
       <w:r>
-        <w:t>Sales Cloud • Service Cloud • Field Service • Flow Builder • Omni-Channel • Case Management • Data Governance • Access and Sharing Controls • Salesforce AI Introduction • Stakeholder Engagement • Solution Design • Release Management</w:t>
+        <w:t>Sales Cloud • Service Cloud • Field Service • Flow Automation • Security and Data Governance • AI Introduction • Solution Design • Release Management</w:t>
       </w:r>
     </w:p>
     <w:p>
@@ -83,7 +83,7 @@
         <w:pStyle w:val="ListBullet"/>
       </w:pPr>
       <w:r>
-        <w:t>Administer and enhance Salesforce to support business operations, translating stakeholder requirements into practical configuration and platform improvements.</w:t>
+        <w:t>Lead Salesforce administration and solution design across production and sandboxes, delivering secure, maintainable changes.</w:t>
       </w:r>
     </w:p>
     <w:p>
@@ -91,7 +91,7 @@
         <w:pStyle w:val="ListBullet"/>
       </w:pPr>
       <w:r>
-        <w:t>Lead the introduction of AI within Salesforce, working with stakeholders to identify suitable use cases and guide adoption in line with business needs.</w:t>
+        <w:t>Lead AI introduction within Salesforce, identifying use cases and guiding stakeholder adoption; automate repetitive processes to reduce manual effort.</w:t>
       </w:r>
     </w:p>
     <w:p>
@@ -99,7 +99,7 @@
         <w:pStyle w:val="ListBullet"/>
       </w:pPr>
       <w:r>
-        <w:t>Automate repetitive manual processes to reduce staff time spent on recurring tasks, improve consistency and free teams to focus on higher-value work.</w:t>
+        <w:t>Manage roles, profiles, Permission Sets, queues, object and field access, and record sharing to strengthen platform security.</w:t>
       </w:r>
     </w:p>
     <w:p>
@@ -107,7 +107,7 @@
         <w:pStyle w:val="ListBullet"/>
       </w:pPr>
       <w:r>
-        <w:t>Liaise with clients, merchants and internal teams to investigate and resolve complex Salesforce issues, clarify requirements and coordinate appropriate solutions.</w:t>
+        <w:t>Work with clients, merchants and internal teams to resolve complex issues using metadata, audit history and access evidence.</w:t>
       </w:r>
     </w:p>
     <w:p>
@@ -115,7 +115,23 @@
         <w:pStyle w:val="ListBullet"/>
       </w:pPr>
       <w:r>
-        <w:t>Contribute to Salesforce enhancement projects, supporting solution design, configuration, testing and documentation to improve user experience and operational efficiency.</w:t>
+        <w:t>Deliver enhancement projects across configuration, automation and reporting, partnering with developers on code-related changes.</w:t>
+      </w:r>
+    </w:p>
+    <w:p>
+      <w:pPr>
+        <w:pStyle w:val="ListBullet"/>
+      </w:pPr>
+      <w:r>
+        <w:t>Coordinate release impact assessments, dependency checks, sandbox validation, deployment planning and post-change verification.</w:t>
+      </w:r>
+    </w:p>
+    <w:p>
+      <w:pPr>
+        <w:pStyle w:val="ListBullet"/>
+      </w:pPr>
+      <w:r>
+        <w:t>Produce solution designs, operational guidance and rollback plans; assess access, reporting and export risks to protect information.</w:t>
       </w:r>
     </w:p>
     <w:p>
@@ -178,13 +194,9 @@
       </w:r>
     </w:p>
     <w:p>
-      <w:r>
-        <w:br w:type="page"/>
-      </w:r>
-    </w:p>
-    <w:p>
       <w:pPr>
         <w:pStyle w:val="Heading1"/>
+        <w:pageBreakBefore/>
       </w:pPr>
       <w:r>
         <w:t>Professional Experience (continued)</w:t>
@@ -755,7 +767,7 @@
     <w:qFormat/>
     <w:rsid w:val="00FC693F"/>
     <w:pPr>
-      <w:spacing w:after="80"/>
+      <w:spacing w:after="60"/>
     </w:pPr>
     <w:rPr>
       <w:rFonts w:ascii="Calibri" w:hAnsi="Calibri"/>

</xml_diff>